<commit_message>
Mobile handoff: app tabs, first-start setup and registration, one-minute sample
Co-Authored-By: Claude Opus 5.5 <noreply@anthropic.com>
</commit_message>
<xml_diff>
--- a/docs/DT-WATCH_Telemetry_Pipeline_Mobile_Handoff.docx
+++ b/docs/DT-WATCH_Telemetry_Pipeline_Mobile_Handoff.docx
@@ -4338,7 +4338,63 @@
         <w:t>Off by default.</w:t>
       </w:r>
       <w:r>
-        <w:t xml:space="preserve"> Nothing is collected or sent until the user turns sharing on.</w:t>
+        <w:t xml:space="preserve"> Nothing is collected or sent until the user turns sharing on. The one exception is the first-install sample below.</w:t>
+      </w:r>
+    </w:p>
+    <w:p>
+      <w:pPr>
+        <w:pStyle w:val="ListBullet"/>
+      </w:pPr>
+      <w:r>
+        <w:rPr>
+          <w:b/>
+        </w:rPr>
+        <w:t>One-minute sample.</w:t>
+      </w:r>
+      <w:r>
+        <w:t xml:space="preserve"> Whenever the user allows location on the setup screen (first install, after an update, or any time the permission was missing), the app shares for about one minute, takes a few readings, and switches sharing off by itself. The setup screen says this before the user allows anything. If the permission is already held, nothing is shared.</w:t>
+      </w:r>
+    </w:p>
+    <w:p>
+      <w:pPr>
+        <w:pStyle w:val="ListBullet"/>
+      </w:pPr>
+      <w:r>
+        <w:rPr>
+          <w:b/>
+        </w:rPr>
+        <w:t>First start after install.</w:t>
+      </w:r>
+      <w:r>
+        <w:t xml:space="preserve"> The app asks for location, phone state and, on Android 13 and later, notifications. Then a pop-up asks for the phone's number to register it. The user can put either off.</w:t>
+      </w:r>
+    </w:p>
+    <w:p>
+      <w:pPr>
+        <w:pStyle w:val="ListBullet"/>
+      </w:pPr>
+      <w:r>
+        <w:rPr>
+          <w:b/>
+        </w:rPr>
+        <w:t>First start after an update.</w:t>
+      </w:r>
+      <w:r>
+        <w:t xml:space="preserve"> The app first checks the permissions and shows the setup screen if location is missing. It then checks whether the phone is registered. If not, the same pop-up asks for the number. If it is, a message says so and nothing more is asked.</w:t>
+      </w:r>
+    </w:p>
+    <w:p>
+      <w:pPr>
+        <w:pStyle w:val="ListBullet"/>
+      </w:pPr>
+      <w:r>
+        <w:rPr>
+          <w:b/>
+        </w:rPr>
+        <w:t>Settings</w:t>
+      </w:r>
+      <w:r>
+        <w:t xml:space="preserve"> shows the registration form only while the phone is not registered. After that it shows the registered number.</w:t>
       </w:r>
     </w:p>
     <w:p>
@@ -4935,7 +4991,7 @@
         <w:t>Current state, to be changed by the app team:</w:t>
       </w:r>
       <w:r>
-        <w:t xml:space="preserve"> the user types the number ("Register this phone" in Settings) and it is not verified against the SIM. The app sends an empty </w:t>
+        <w:t xml:space="preserve"> the user types the number (in the pop-up at first start, or under "Register this phone" in Settings) and it is not verified against the SIM. "Registered" is what the phone remembers from the server's answer; it survives an update and is lost on uninstall. The app sends an empty </w:t>
       </w:r>
       <w:r>
         <w:rPr>
@@ -7600,7 +7656,7 @@
     <w:p/>
     <w:p>
       <w:r>
-        <w:t>The "I am an NTC employee" tick box only opens the tabs and marks drives as staff drives. It grants nothing on the server. The app has no staff login.</w:t>
+        <w:t>Everyone gets Signal, Wi-Fi and Settings. The Cells and Map tabs, and with Map the drive test and site photo, appear only after "I am an NTC employee" is ticked in Settings; until then they are not on the bar at all. The tick box also marks drives as staff drives. It grants nothing on the server. The app has no staff login.</w:t>
       </w:r>
     </w:p>
     <w:p>

</xml_diff>

<commit_message>
Project notes and mobile handoff for app 1.2.2
Handoff: 10-digit registration number format, Cells tab serving-site
lookup. Notes: bandwidth commit, document updates of 27 October, APK
naming with version, app 1.2.2.

Co-Authored-By: Claude Opus 5.5 <noreply@anthropic.com>
</commit_message>
<xml_diff>
--- a/docs/DT-WATCH_Telemetry_Pipeline_Mobile_Handoff.docx
+++ b/docs/DT-WATCH_Telemetry_Pipeline_Mobile_Handoff.docx
@@ -40,7 +40,7 @@
         <w:t>Last updated:</w:t>
       </w:r>
       <w:r>
-        <w:t xml:space="preserve"> 2026-10-24 (signed rescue sharing, serving-site lookup, SINR fill-in, upload queue). This version replaces the guide of 2026-09-21 and its two addenda.</w:t>
+        <w:t xml:space="preserve"> 2026-10-27 (10-digit registration number, site names on the Cells tab, reading status, indoor/outdoor tag, channel bandwidth; earlier: signed rescue sharing, serving-site lookup, SINR fill-in, upload queue). This version replaces the guide of 2026-09-21 and its two addenda.</w:t>
       </w:r>
     </w:p>
     <w:p>
@@ -5776,7 +5776,7 @@
                 <w:rFonts w:ascii="Consolas" w:hAnsi="Consolas"/>
                 <w:sz w:val="18"/>
               </w:rPr>
-              <w:t xml:space="preserve">  "msisdn": "+97798...",</w:t>
+              <w:t xml:space="preserve">  "msisdn": "98XXXXXXXX",</w:t>
             </w:r>
           </w:p>
           <w:p>
@@ -9905,6 +9905,32 @@
       </w:r>
       <w:r>
         <w:t>).</w:t>
+      </w:r>
+    </w:p>
+    <w:p>
+      <w:r>
+        <w:t>Since app 1.2.2 (2026-10-27) the reference app's Cells tab asks the same call for every cell it lists. A cell with a cell number is sent without a position; a neighbour known only by PCI, scrambling code or BCCH/BSIC is sent with Android's last known position (no GPS fix), and its answer is kept per area of about 1 km. Without an answer the card shows no site line.</w:t>
+      </w:r>
+    </w:p>
+    <w:p>
+      <w:r>
+        <w:rPr>
+          <w:b/>
+        </w:rPr>
+        <w:t>Number format for registration.</w:t>
+      </w:r>
+      <w:r>
+        <w:t xml:space="preserve"> Ask for the 10-digit NT mobile number (9XXXXXXXXX: 98, 97 and other prefixes), digits only, no 977 or +977; the server adds the country code (a number sent with 977 is also accepted). The reference app's field (</w:t>
+      </w:r>
+      <w:r>
+        <w:rPr>
+          <w:rFonts w:ascii="Consolas" w:hAnsi="Consolas"/>
+          <w:sz w:val="20"/>
+        </w:rPr>
+        <w:t>NumberField.kt</w:t>
+      </w:r>
+      <w:r>
+        <w:t>) takes digits only, at most 10, keeps the last 10 digits of a pasted +977 number, and shows a red border while incomplete and a green one at 10 digits; Register is refused otherwise.</w:t>
       </w:r>
     </w:p>
     <w:p>

</xml_diff>

<commit_message>
Neighbour cells with phone readings; sector CQI; Collections scroll
Phones (app 1.2.3) send the other cells heard with each reading, at
most 8. The server checks them, names each cell's site and sector at
upload, and stores them on the reading (migration 0147). Reading lists
show a Neighbours column; Collections and Telemetry Drive Test show
"Neighbour cells heard" per session, including how often a cell was
3 dB or more stronger than the serving one.

The sector table's CQI now uses the phone's value, else the SINR or
RSRQ estimate, as the reading list does. Clicking a Collections
session scrolls to its route map.

Co-Authored-By: Claude Opus 5.5 <noreply@anthropic.com>
</commit_message>
<xml_diff>
--- a/docs/DT-WATCH_Telemetry_Pipeline_Mobile_Handoff.docx
+++ b/docs/DT-WATCH_Telemetry_Pipeline_Mobile_Handoff.docx
@@ -40,7 +40,7 @@
         <w:t>Last updated:</w:t>
       </w:r>
       <w:r>
-        <w:t xml:space="preserve"> 2026-10-27 (10-digit registration number, site names on the Cells tab, reading status, indoor/outdoor tag, channel bandwidth; earlier: signed rescue sharing, serving-site lookup, SINR fill-in, upload queue). This version replaces the guide of 2026-09-21 and its two addenda.</w:t>
+        <w:t xml:space="preserve"> 2026-10-27 (neighbour cells with every reading, 10-digit registration number, site names on the Cells tab, reading status, indoor/outdoor tag, channel bandwidth; earlier: signed rescue sharing, serving-site lookup, SINR fill-in, upload queue). This version replaces the guide of 2026-09-21 and its two addenda.</w:t>
       </w:r>
     </w:p>
     <w:p>
@@ -4567,6 +4567,51 @@
           </w:p>
         </w:tc>
       </w:tr>
+      <w:tr>
+        <w:tc>
+          <w:tcPr>
+            <w:tcW w:type="dxa" w:w="2880"/>
+            <w:shd w:val="clear" w:color="auto" w:fill="EEF2F7"/>
+          </w:tcPr>
+          <w:p>
+            <w:r>
+              <w:rPr>
+                <w:rFonts w:ascii="Consolas" w:hAnsi="Consolas"/>
+                <w:sz w:val="18"/>
+              </w:rPr>
+              <w:t>neighbours</w:t>
+            </w:r>
+          </w:p>
+        </w:tc>
+        <w:tc>
+          <w:tcPr>
+            <w:tcW w:type="dxa" w:w="2880"/>
+            <w:shd w:val="clear" w:color="auto" w:fill="EEF2F7"/>
+          </w:tcPr>
+          <w:p>
+            <w:r>
+              <w:rPr>
+                <w:sz w:val="19"/>
+              </w:rPr>
+              <w:t>array of objects</w:t>
+            </w:r>
+          </w:p>
+        </w:tc>
+        <w:tc>
+          <w:tcPr>
+            <w:tcW w:type="dxa" w:w="2880"/>
+            <w:shd w:val="clear" w:color="auto" w:fill="EEF2F7"/>
+          </w:tcPr>
+          <w:p>
+            <w:r>
+              <w:rPr>
+                <w:sz w:val="19"/>
+              </w:rPr>
+              <w:t>The other cells heard at the same moment, at most 8 (see below). Leave it out when there are none. Added 2026-10-27</w:t>
+            </w:r>
+          </w:p>
+        </w:tc>
+      </w:tr>
     </w:tbl>
     <w:p/>
     <w:p>
@@ -4730,6 +4775,471 @@
       </w:r>
       <w:r>
         <w:t xml:space="preserve"> is missing, the first carrier of the list stands in. 2G and 3G readings have no bandwidth.</w:t>
+      </w:r>
+    </w:p>
+    <w:p>
+      <w:r>
+        <w:rPr>
+          <w:b/>
+        </w:rPr>
+        <w:t>Neighbour cells (2026-10-27).</w:t>
+      </w:r>
+      <w:r>
+        <w:t xml:space="preserve"> With each reading, send the other cells of the same </w:t>
+      </w:r>
+      <w:r>
+        <w:rPr>
+          <w:rFonts w:ascii="Consolas" w:hAnsi="Consolas"/>
+          <w:sz w:val="20"/>
+        </w:rPr>
+        <w:t>getAllCellInfo()</w:t>
+      </w:r>
+      <w:r>
+        <w:t xml:space="preserve"> call as </w:t>
+      </w:r>
+      <w:r>
+        <w:rPr>
+          <w:rFonts w:ascii="Consolas" w:hAnsi="Consolas"/>
+          <w:sz w:val="20"/>
+        </w:rPr>
+        <w:t>neighbours</w:t>
+      </w:r>
+      <w:r>
+        <w:t>. Leave out every entry flagged registered (the serving cell, sometimes listed twice) and every cell without an identity or a level. Order and cap: cells of the serving technology first, strongest first, at most 6; then at most 3 of each other technology; at most 8 in all. Each object carries only what identifies the cell and its level:</w:t>
+      </w:r>
+    </w:p>
+    <w:tbl>
+      <w:tblPr>
+        <w:tblStyle w:val="TableGrid"/>
+        <w:tblW w:type="auto" w:w="0"/>
+        <w:jc w:val="center"/>
+        <w:tblLook w:firstColumn="1" w:firstRow="1" w:lastColumn="0" w:lastRow="0" w:noHBand="0" w:noVBand="1" w:val="04A0"/>
+      </w:tblPr>
+      <w:tblGrid>
+        <w:gridCol w:w="4320"/>
+        <w:gridCol w:w="4320"/>
+      </w:tblGrid>
+      <w:tr>
+        <w:tc>
+          <w:tcPr>
+            <w:tcW w:type="dxa" w:w="4320"/>
+            <w:shd w:val="clear" w:color="auto" w:fill="0B1626"/>
+          </w:tcPr>
+          <w:p>
+            <w:r>
+              <w:rPr>
+                <w:b/>
+                <w:color w:val="FFFFFF"/>
+                <w:sz w:val="19"/>
+              </w:rPr>
+              <w:t>Key</w:t>
+            </w:r>
+          </w:p>
+        </w:tc>
+        <w:tc>
+          <w:tcPr>
+            <w:tcW w:type="dxa" w:w="4320"/>
+            <w:shd w:val="clear" w:color="auto" w:fill="0B1626"/>
+          </w:tcPr>
+          <w:p>
+            <w:r>
+              <w:rPr>
+                <w:b/>
+                <w:color w:val="FFFFFF"/>
+                <w:sz w:val="19"/>
+              </w:rPr>
+              <w:t>Meaning</w:t>
+            </w:r>
+          </w:p>
+        </w:tc>
+      </w:tr>
+      <w:tr>
+        <w:tc>
+          <w:tcPr>
+            <w:tcW w:type="dxa" w:w="4320"/>
+          </w:tcPr>
+          <w:p>
+            <w:r>
+              <w:rPr>
+                <w:rFonts w:ascii="Consolas" w:hAnsi="Consolas"/>
+                <w:sz w:val="18"/>
+              </w:rPr>
+              <w:t>net</w:t>
+            </w:r>
+          </w:p>
+        </w:tc>
+        <w:tc>
+          <w:tcPr>
+            <w:tcW w:type="dxa" w:w="4320"/>
+          </w:tcPr>
+          <w:p>
+            <w:r>
+              <w:rPr>
+                <w:rFonts w:ascii="Consolas" w:hAnsi="Consolas"/>
+                <w:sz w:val="18"/>
+              </w:rPr>
+              <w:t>LTE</w:t>
+            </w:r>
+            <w:r>
+              <w:rPr>
+                <w:sz w:val="19"/>
+              </w:rPr>
+              <w:t xml:space="preserve">, </w:t>
+            </w:r>
+            <w:r>
+              <w:rPr>
+                <w:rFonts w:ascii="Consolas" w:hAnsi="Consolas"/>
+                <w:sz w:val="18"/>
+              </w:rPr>
+              <w:t>UMTS</w:t>
+            </w:r>
+            <w:r>
+              <w:rPr>
+                <w:sz w:val="19"/>
+              </w:rPr>
+              <w:t xml:space="preserve"> or </w:t>
+            </w:r>
+            <w:r>
+              <w:rPr>
+                <w:rFonts w:ascii="Consolas" w:hAnsi="Consolas"/>
+                <w:sz w:val="18"/>
+              </w:rPr>
+              <w:t>GSM</w:t>
+            </w:r>
+            <w:r>
+              <w:rPr>
+                <w:sz w:val="19"/>
+              </w:rPr>
+              <w:t xml:space="preserve"> (5G neighbours are not sent yet)</w:t>
+            </w:r>
+          </w:p>
+        </w:tc>
+      </w:tr>
+      <w:tr>
+        <w:tc>
+          <w:tcPr>
+            <w:tcW w:type="dxa" w:w="4320"/>
+            <w:shd w:val="clear" w:color="auto" w:fill="EEF2F7"/>
+          </w:tcPr>
+          <w:p>
+            <w:r>
+              <w:rPr>
+                <w:rFonts w:ascii="Consolas" w:hAnsi="Consolas"/>
+                <w:sz w:val="18"/>
+              </w:rPr>
+              <w:t>pci</w:t>
+            </w:r>
+            <w:r>
+              <w:rPr>
+                <w:sz w:val="19"/>
+              </w:rPr>
+              <w:t xml:space="preserve"> / </w:t>
+            </w:r>
+            <w:r>
+              <w:rPr>
+                <w:rFonts w:ascii="Consolas" w:hAnsi="Consolas"/>
+                <w:sz w:val="18"/>
+              </w:rPr>
+              <w:t>psc</w:t>
+            </w:r>
+            <w:r>
+              <w:rPr>
+                <w:sz w:val="19"/>
+              </w:rPr>
+              <w:t xml:space="preserve"> / </w:t>
+            </w:r>
+            <w:r>
+              <w:rPr>
+                <w:rFonts w:ascii="Consolas" w:hAnsi="Consolas"/>
+                <w:sz w:val="18"/>
+              </w:rPr>
+              <w:t>bcch</w:t>
+            </w:r>
+            <w:r>
+              <w:rPr>
+                <w:sz w:val="19"/>
+              </w:rPr>
+              <w:t xml:space="preserve">, </w:t>
+            </w:r>
+            <w:r>
+              <w:rPr>
+                <w:rFonts w:ascii="Consolas" w:hAnsi="Consolas"/>
+                <w:sz w:val="18"/>
+              </w:rPr>
+              <w:t>bsic</w:t>
+            </w:r>
+          </w:p>
+        </w:tc>
+        <w:tc>
+          <w:tcPr>
+            <w:tcW w:type="dxa" w:w="4320"/>
+            <w:shd w:val="clear" w:color="auto" w:fill="EEF2F7"/>
+          </w:tcPr>
+          <w:p>
+            <w:r>
+              <w:rPr>
+                <w:sz w:val="19"/>
+              </w:rPr>
+              <w:t>Identity: PCI on 4G, scrambling code on 3G, BCCH and BSIC on 2G. Required</w:t>
+            </w:r>
+          </w:p>
+        </w:tc>
+      </w:tr>
+      <w:tr>
+        <w:tc>
+          <w:tcPr>
+            <w:tcW w:type="dxa" w:w="4320"/>
+          </w:tcPr>
+          <w:p>
+            <w:r>
+              <w:rPr>
+                <w:rFonts w:ascii="Consolas" w:hAnsi="Consolas"/>
+                <w:sz w:val="18"/>
+              </w:rPr>
+              <w:t>arfcn</w:t>
+            </w:r>
+            <w:r>
+              <w:rPr>
+                <w:sz w:val="19"/>
+              </w:rPr>
+              <w:t xml:space="preserve">, </w:t>
+            </w:r>
+            <w:r>
+              <w:rPr>
+                <w:rFonts w:ascii="Consolas" w:hAnsi="Consolas"/>
+                <w:sz w:val="18"/>
+              </w:rPr>
+              <w:t>band</w:t>
+            </w:r>
+          </w:p>
+        </w:tc>
+        <w:tc>
+          <w:tcPr>
+            <w:tcW w:type="dxa" w:w="4320"/>
+          </w:tcPr>
+          <w:p>
+            <w:r>
+              <w:rPr>
+                <w:sz w:val="19"/>
+              </w:rPr>
+              <w:t>Channel (EARFCN, UARFCN, BCCH ARFCN) and 3GPP band, when known</w:t>
+            </w:r>
+          </w:p>
+        </w:tc>
+      </w:tr>
+      <w:tr>
+        <w:tc>
+          <w:tcPr>
+            <w:tcW w:type="dxa" w:w="4320"/>
+            <w:shd w:val="clear" w:color="auto" w:fill="EEF2F7"/>
+          </w:tcPr>
+          <w:p>
+            <w:r>
+              <w:rPr>
+                <w:rFonts w:ascii="Consolas" w:hAnsi="Consolas"/>
+                <w:sz w:val="18"/>
+              </w:rPr>
+              <w:t>cell_id</w:t>
+            </w:r>
+            <w:r>
+              <w:rPr>
+                <w:sz w:val="19"/>
+              </w:rPr>
+              <w:t xml:space="preserve">, </w:t>
+            </w:r>
+            <w:r>
+              <w:rPr>
+                <w:rFonts w:ascii="Consolas" w:hAnsi="Consolas"/>
+                <w:sz w:val="18"/>
+              </w:rPr>
+              <w:t>tac</w:t>
+            </w:r>
+          </w:p>
+        </w:tc>
+        <w:tc>
+          <w:tcPr>
+            <w:tcW w:type="dxa" w:w="4320"/>
+            <w:shd w:val="clear" w:color="auto" w:fill="EEF2F7"/>
+          </w:tcPr>
+          <w:p>
+            <w:r>
+              <w:rPr>
+                <w:sz w:val="19"/>
+              </w:rPr>
+              <w:t>Only if the phone reports them for the neighbour (most do not)</w:t>
+            </w:r>
+          </w:p>
+        </w:tc>
+      </w:tr>
+      <w:tr>
+        <w:tc>
+          <w:tcPr>
+            <w:tcW w:type="dxa" w:w="4320"/>
+          </w:tcPr>
+          <w:p>
+            <w:r>
+              <w:rPr>
+                <w:rFonts w:ascii="Consolas" w:hAnsi="Consolas"/>
+                <w:sz w:val="18"/>
+              </w:rPr>
+              <w:t>rsrp</w:t>
+            </w:r>
+            <w:r>
+              <w:rPr>
+                <w:sz w:val="19"/>
+              </w:rPr>
+              <w:t xml:space="preserve">, </w:t>
+            </w:r>
+            <w:r>
+              <w:rPr>
+                <w:rFonts w:ascii="Consolas" w:hAnsi="Consolas"/>
+                <w:sz w:val="18"/>
+              </w:rPr>
+              <w:t>rsrq</w:t>
+            </w:r>
+            <w:r>
+              <w:rPr>
+                <w:sz w:val="19"/>
+              </w:rPr>
+              <w:t xml:space="preserve">, </w:t>
+            </w:r>
+            <w:r>
+              <w:rPr>
+                <w:rFonts w:ascii="Consolas" w:hAnsi="Consolas"/>
+                <w:sz w:val="18"/>
+              </w:rPr>
+              <w:t>sinr</w:t>
+            </w:r>
+          </w:p>
+        </w:tc>
+        <w:tc>
+          <w:tcPr>
+            <w:tcW w:type="dxa" w:w="4320"/>
+          </w:tcPr>
+          <w:p>
+            <w:r>
+              <w:rPr>
+                <w:sz w:val="19"/>
+              </w:rPr>
+              <w:t xml:space="preserve">4G level and quality; </w:t>
+            </w:r>
+            <w:r>
+              <w:rPr>
+                <w:rFonts w:ascii="Consolas" w:hAnsi="Consolas"/>
+                <w:sz w:val="18"/>
+              </w:rPr>
+              <w:t>rsrp</w:t>
+            </w:r>
+            <w:r>
+              <w:rPr>
+                <w:sz w:val="19"/>
+              </w:rPr>
+              <w:t xml:space="preserve"> is required on 4G</w:t>
+            </w:r>
+          </w:p>
+        </w:tc>
+      </w:tr>
+      <w:tr>
+        <w:tc>
+          <w:tcPr>
+            <w:tcW w:type="dxa" w:w="4320"/>
+            <w:shd w:val="clear" w:color="auto" w:fill="EEF2F7"/>
+          </w:tcPr>
+          <w:p>
+            <w:r>
+              <w:rPr>
+                <w:rFonts w:ascii="Consolas" w:hAnsi="Consolas"/>
+                <w:sz w:val="18"/>
+              </w:rPr>
+              <w:t>rscp</w:t>
+            </w:r>
+            <w:r>
+              <w:rPr>
+                <w:sz w:val="19"/>
+              </w:rPr>
+              <w:t xml:space="preserve">, </w:t>
+            </w:r>
+            <w:r>
+              <w:rPr>
+                <w:rFonts w:ascii="Consolas" w:hAnsi="Consolas"/>
+                <w:sz w:val="18"/>
+              </w:rPr>
+              <w:t>ecio</w:t>
+            </w:r>
+          </w:p>
+        </w:tc>
+        <w:tc>
+          <w:tcPr>
+            <w:tcW w:type="dxa" w:w="4320"/>
+            <w:shd w:val="clear" w:color="auto" w:fill="EEF2F7"/>
+          </w:tcPr>
+          <w:p>
+            <w:r>
+              <w:rPr>
+                <w:sz w:val="19"/>
+              </w:rPr>
+              <w:t xml:space="preserve">3G level and quality; </w:t>
+            </w:r>
+            <w:r>
+              <w:rPr>
+                <w:rFonts w:ascii="Consolas" w:hAnsi="Consolas"/>
+                <w:sz w:val="18"/>
+              </w:rPr>
+              <w:t>rscp</w:t>
+            </w:r>
+            <w:r>
+              <w:rPr>
+                <w:sz w:val="19"/>
+              </w:rPr>
+              <w:t xml:space="preserve"> is required on 3G</w:t>
+            </w:r>
+          </w:p>
+        </w:tc>
+      </w:tr>
+      <w:tr>
+        <w:tc>
+          <w:tcPr>
+            <w:tcW w:type="dxa" w:w="4320"/>
+          </w:tcPr>
+          <w:p>
+            <w:r>
+              <w:rPr>
+                <w:rFonts w:ascii="Consolas" w:hAnsi="Consolas"/>
+                <w:sz w:val="18"/>
+              </w:rPr>
+              <w:t>rssi</w:t>
+            </w:r>
+          </w:p>
+        </w:tc>
+        <w:tc>
+          <w:tcPr>
+            <w:tcW w:type="dxa" w:w="4320"/>
+          </w:tcPr>
+          <w:p>
+            <w:r>
+              <w:rPr>
+                <w:sz w:val="19"/>
+              </w:rPr>
+              <w:t>2G level; required on 2G</w:t>
+            </w:r>
+          </w:p>
+        </w:tc>
+      </w:tr>
+    </w:tbl>
+    <w:p/>
+    <w:p>
+      <w:r>
+        <w:t xml:space="preserve">Example: </w:t>
+      </w:r>
+      <w:r>
+        <w:rPr>
+          <w:rFonts w:ascii="Consolas" w:hAnsi="Consolas"/>
+          <w:sz w:val="20"/>
+        </w:rPr>
+        <w:t>"neighbours": [{"net":"LTE","pci":95,"arfcn":6200,"band":20,"rsrp":-91,"rsrq":-11}]</w:t>
+      </w:r>
+      <w:r>
+        <w:t>. The server keeps at most 8, drops unknown keys and values out of range, and names each cell (site, sector, distance) from the reading's position with the same rule as the serving cell, so a reading without a position keeps unnamed neighbours. The neighbours are stored on the reading and deleted with it. The web pages show them per reading and, per session, which cells were heard and how often one was 3 dB or more stronger than the serving cell.</w:t>
       </w:r>
     </w:p>
     <w:p>

</xml_diff>

<commit_message>
Calls in analysis; Collections scroll; push address warning
Each phone call's start and end cell is named by site and sector on
VoLTE Quality and the diagnosis dashboard. Sector tables count the calls
started on each sector and how many fell back to 2G/3G. The problem
check gains two causes from the customer's calls within 3 hours of a
call-drop, no-signal or other complaint: calls fell back to 2G/3G, and
calls ended on a weak signal.

The complaint page says area requests are silent on the phone and warns
when the customer's phone has sent no push address, so no notification
can reach it. Clicking a Collections session brings its route heading
to the top once the route has loaded.

Co-Authored-By: Claude Opus 5.5 <noreply@anthropic.com>
</commit_message>
<xml_diff>
--- a/docs/DT-WATCH_Telemetry_Pipeline_Mobile_Handoff.docx
+++ b/docs/DT-WATCH_Telemetry_Pipeline_Mobile_Handoff.docx
@@ -40,7 +40,7 @@
         <w:t>Last updated:</w:t>
       </w:r>
       <w:r>
-        <w:t xml:space="preserve"> 2026-10-27 (3G/2G level fill-in, neighbour cells with every reading, 10-digit registration number, site names on the Cells tab, reading status, indoor/outdoor tag, channel bandwidth; earlier: signed rescue sharing, serving-site lookup, SINR fill-in, upload queue). This version replaces the guide of 2026-09-21 and its two addenda.</w:t>
+        <w:t xml:space="preserve"> 2026-10-27 (push address retried until accepted, 3G/2G level fill-in, neighbour cells with every reading, 10-digit registration number, site names on the Cells tab, reading status, indoor/outdoor tag, channel bandwidth; earlier: signed rescue sharing, serving-site lookup, SINR fill-in, upload queue). This version replaces the guide of 2026-09-21 and its two addenda.</w:t>
       </w:r>
     </w:p>
     <w:p>
@@ -7839,7 +7839,27 @@
         <w:t>{"fcm_token": "..."}</w:t>
       </w:r>
       <w:r>
-        <w:t xml:space="preserve"> whenever Firebase rotates the token of a registered phone.</w:t>
+        <w:t xml:space="preserve"> whenever Firebase rotates the token of a registered phone, after registering, and on each app start. Retry it until the server accepts it (2026-10-27): the reference app sent it once, and a phone that could not reach DT-WATCH at that moment had no push address, so no request notification could reach it. App 1.2.5 queues the send as a background job with a network condition and backoff. A </w:t>
+      </w:r>
+      <w:r>
+        <w:rPr>
+          <w:rFonts w:ascii="Consolas" w:hAnsi="Consolas"/>
+          <w:sz w:val="20"/>
+        </w:rPr>
+        <w:t>sample_request</w:t>
+      </w:r>
+      <w:r>
+        <w:t xml:space="preserve"> shows nothing on the phone; only </w:t>
+      </w:r>
+      <w:r>
+        <w:rPr>
+          <w:rFonts w:ascii="Consolas" w:hAnsi="Consolas"/>
+          <w:sz w:val="20"/>
+        </w:rPr>
+        <w:t>trace_request</w:t>
+      </w:r>
+      <w:r>
+        <w:t xml:space="preserve"> shows a notification, so the app needs the notification permission (Android 13 and later).</w:t>
       </w:r>
     </w:p>
     <w:p>

</xml_diff>

<commit_message>
Mobile handoff: share until fixed, Help improve NTC's network (app 1.3.0)
Co-Authored-By: Claude Opus 5.5 <noreply@anthropic.com>
</commit_message>
<xml_diff>
--- a/docs/DT-WATCH_Telemetry_Pipeline_Mobile_Handoff.docx
+++ b/docs/DT-WATCH_Telemetry_Pipeline_Mobile_Handoff.docx
@@ -40,7 +40,7 @@
         <w:t>Last updated:</w:t>
       </w:r>
       <w:r>
-        <w:t xml:space="preserve"> 2026-10-27 (push address retried until accepted, 3G/2G level fill-in, neighbour cells with every reading, 10-digit registration number, site names on the Cells tab, reading status, indoor/outdoor tag, channel bandwidth; earlier: signed rescue sharing, serving-site lookup, SINR fill-in, upload queue). This version replaces the guide of 2026-09-21 and its two addenda.</w:t>
+        <w:t xml:space="preserve"> 2026-10-29 (app 1.3.0: "share my location until this is fixed" on a problem report, and the opt-in "Help improve NTC's network" readings; earlier: push address retried until accepted, 3G/2G level fill-in, neighbour cells with every reading, 10-digit registration number, site names on the Cells tab, reading status, indoor/outdoor tag, channel bandwidth; earlier: signed rescue sharing, serving-site lookup, SINR fill-in, upload queue). This version replaces the guide of 2026-09-21 and its two addenda.</w:t>
       </w:r>
     </w:p>
     <w:p>
@@ -9293,6 +9293,310 @@
       </w:r>
     </w:p>
     <w:p>
+      <w:r>
+        <w:rPr>
+          <w:b/>
+        </w:rPr>
+        <w:t>Share until fixed (29 October 2026, app 1.3.0).</w:t>
+      </w:r>
+      <w:r>
+        <w:t xml:space="preserve"> The report screen has a tick box, "Share my location with NTC until this is fixed". When the person ticks it, add </w:t>
+      </w:r>
+      <w:r>
+        <w:rPr>
+          <w:rFonts w:ascii="Consolas" w:hAnsi="Consolas"/>
+          <w:sz w:val="20"/>
+        </w:rPr>
+        <w:t>"share_until_fixed": true</w:t>
+      </w:r>
+      <w:r>
+        <w:t xml:space="preserve"> to the report. The server then starts the customer's own sharing for this complaint and answers:</w:t>
+      </w:r>
+    </w:p>
+    <w:tbl>
+      <w:tblPr>
+        <w:tblStyle w:val="TableGrid"/>
+        <w:tblW w:type="auto" w:w="0"/>
+        <w:tblLook w:firstColumn="1" w:firstRow="1" w:lastColumn="0" w:lastRow="0" w:noHBand="0" w:noVBand="1" w:val="04A0"/>
+      </w:tblPr>
+      <w:tblGrid>
+        <w:gridCol w:w="8640"/>
+      </w:tblGrid>
+      <w:tr>
+        <w:tc>
+          <w:tcPr>
+            <w:tcW w:type="dxa" w:w="8640"/>
+            <w:shd w:val="clear" w:color="auto" w:fill="F1F4F8"/>
+          </w:tcPr>
+          <w:p>
+            <w:pPr>
+              <w:spacing w:after="0"/>
+            </w:pPr>
+            <w:r>
+              <w:rPr>
+                <w:rFonts w:ascii="Consolas" w:hAnsi="Consolas"/>
+                <w:sz w:val="18"/>
+              </w:rPr>
+              <w:t>{"id": 41, "stored": true,</w:t>
+            </w:r>
+          </w:p>
+          <w:p>
+            <w:pPr>
+              <w:spacing w:after="0"/>
+            </w:pPr>
+            <w:r>
+              <w:rPr>
+                <w:rFonts w:ascii="Consolas" w:hAnsi="Consolas"/>
+                <w:sz w:val="18"/>
+              </w:rPr>
+              <w:t xml:space="preserve"> "share": {"trace_id": "8a1f...", "expires_at": "2026-11-01T10:00:00+05:45", "interval_s": 300}}</w:t>
+            </w:r>
+          </w:p>
+        </w:tc>
+      </w:tr>
+    </w:tbl>
+    <w:p/>
+    <w:p>
+      <w:r>
+        <w:t xml:space="preserve">Send readings to that trace exactly as for an accepted location request (section 9: </w:t>
+      </w:r>
+      <w:r>
+        <w:rPr>
+          <w:rFonts w:ascii="Consolas" w:hAnsi="Consolas"/>
+          <w:sz w:val="20"/>
+        </w:rPr>
+        <w:t>POST device/trace-requests/&lt;trace_id&gt;/samples/</w:t>
+      </w:r>
+      <w:r>
+        <w:t xml:space="preserve">, signed), every </w:t>
+      </w:r>
+      <w:r>
+        <w:rPr>
+          <w:rFonts w:ascii="Consolas" w:hAnsi="Consolas"/>
+          <w:sz w:val="20"/>
+        </w:rPr>
+        <w:t>interval_s</w:t>
+      </w:r>
+      <w:r>
+        <w:t xml:space="preserve"> seconds, with a visible notification and a Stop action. Stop when </w:t>
+      </w:r>
+      <w:r>
+        <w:rPr>
+          <w:rFonts w:ascii="Consolas" w:hAnsi="Consolas"/>
+          <w:sz w:val="20"/>
+        </w:rPr>
+        <w:t>expires_at</w:t>
+      </w:r>
+      <w:r>
+        <w:t xml:space="preserve"> passes (at most 72 hours), when the person taps Stop (</w:t>
+      </w:r>
+      <w:r>
+        <w:rPr>
+          <w:rFonts w:ascii="Consolas" w:hAnsi="Consolas"/>
+          <w:sz w:val="20"/>
+        </w:rPr>
+        <w:t>respond</w:t>
+      </w:r>
+      <w:r>
+        <w:t xml:space="preserve"> with </w:t>
+      </w:r>
+      <w:r>
+        <w:rPr>
+          <w:rFonts w:ascii="Consolas" w:hAnsi="Consolas"/>
+          <w:sz w:val="20"/>
+        </w:rPr>
+        <w:t>stop</w:t>
+      </w:r>
+      <w:r>
+        <w:t xml:space="preserve">), or when the server answers 409 or 404: it does so once NTC closes the complaint. Run no speed tests during this sharing; the report already carried one. In the SDK: </w:t>
+      </w:r>
+      <w:r>
+        <w:rPr>
+          <w:rFonts w:ascii="Consolas" w:hAnsi="Consolas"/>
+          <w:sz w:val="20"/>
+        </w:rPr>
+        <w:t>NetProblem.send(context, category, note, shareUntilFixed = true)</w:t>
+      </w:r>
+      <w:r>
+        <w:t xml:space="preserve"> returns </w:t>
+      </w:r>
+      <w:r>
+        <w:rPr>
+          <w:rFonts w:ascii="Consolas" w:hAnsi="Consolas"/>
+          <w:sz w:val="20"/>
+        </w:rPr>
+        <w:t>Outcome.share</w:t>
+      </w:r>
+      <w:r>
+        <w:t xml:space="preserve"> (trace id, expiry in ms, interval in ms); the reference app passes it to its sharing service.</w:t>
+      </w:r>
+    </w:p>
+    <w:p>
+      <w:pPr>
+        <w:pStyle w:val="Heading1"/>
+      </w:pPr>
+      <w:r>
+        <w:t>10b. Help improve NTC's network (29 October 2026, app 1.3.0)</w:t>
+      </w:r>
+    </w:p>
+    <w:p>
+      <w:r>
+        <w:t>An opt-in, off by default. The app asks once on the first start after install or after an update, before registration, and offers a switch in Settings. When on, the phone sends four readings a day, around 00:00, 10:00, 14:00 and 19:00 local time, each at a random moment within 30 minutes of its slot (WorkManager, so Android may delay one while the phone sleeps).</w:t>
+      </w:r>
+    </w:p>
+    <w:p>
+      <w:r>
+        <w:rPr>
+          <w:rFonts w:ascii="Consolas" w:hAnsi="Consolas"/>
+          <w:sz w:val="20"/>
+        </w:rPr>
+        <w:t>POST /api/telemetry/v1/scheduled-readings/</w:t>
+      </w:r>
+      <w:r>
+        <w:t xml:space="preserve"> with the shared key only (</w:t>
+      </w:r>
+      <w:r>
+        <w:rPr>
+          <w:rFonts w:ascii="Consolas" w:hAnsi="Consolas"/>
+          <w:sz w:val="20"/>
+        </w:rPr>
+        <w:t>Authorization: Bearer tel_...</w:t>
+      </w:r>
+      <w:r>
+        <w:t>). Do not sign it: a signed call is refused, because these readings must not name the phone.</w:t>
+      </w:r>
+    </w:p>
+    <w:tbl>
+      <w:tblPr>
+        <w:tblStyle w:val="TableGrid"/>
+        <w:tblW w:type="auto" w:w="0"/>
+        <w:tblLook w:firstColumn="1" w:firstRow="1" w:lastColumn="0" w:lastRow="0" w:noHBand="0" w:noVBand="1" w:val="04A0"/>
+      </w:tblPr>
+      <w:tblGrid>
+        <w:gridCol w:w="8640"/>
+      </w:tblGrid>
+      <w:tr>
+        <w:tc>
+          <w:tcPr>
+            <w:tcW w:type="dxa" w:w="8640"/>
+            <w:shd w:val="clear" w:color="auto" w:fill="F1F4F8"/>
+          </w:tcPr>
+          <w:p>
+            <w:pPr>
+              <w:spacing w:after="0"/>
+            </w:pPr>
+            <w:r>
+              <w:rPr>
+                <w:rFonts w:ascii="Consolas" w:hAnsi="Consolas"/>
+                <w:sz w:val="18"/>
+              </w:rPr>
+              <w:t>{"anon_id": "random id, renewed every 30 days", "ts": 1761710400000, "slot": 19,</w:t>
+            </w:r>
+          </w:p>
+          <w:p>
+            <w:pPr>
+              <w:spacing w:after="0"/>
+            </w:pPr>
+            <w:r>
+              <w:rPr>
+                <w:rFonts w:ascii="Consolas" w:hAnsi="Consolas"/>
+                <w:sz w:val="18"/>
+              </w:rPr>
+              <w:t xml:space="preserve"> "network_type": "LTE", "band": "B3 (1800)", "level_dbm": -104, "rsrq_db": -12,</w:t>
+            </w:r>
+          </w:p>
+          <w:p>
+            <w:pPr>
+              <w:spacing w:after="0"/>
+            </w:pPr>
+            <w:r>
+              <w:rPr>
+                <w:rFonts w:ascii="Consolas" w:hAnsi="Consolas"/>
+                <w:sz w:val="18"/>
+              </w:rPr>
+              <w:t xml:space="preserve"> "sinr_db": 6, "mcc": "429", "mnc": "01", "cell_id": 26385921, "tac": 1201, "pci": 120}</w:t>
+            </w:r>
+          </w:p>
+        </w:tc>
+      </w:tr>
+    </w:tbl>
+    <w:p/>
+    <w:p>
+      <w:r>
+        <w:t xml:space="preserve">No position is read or sent: read the cell without a GPS fix. </w:t>
+      </w:r>
+      <w:r>
+        <w:rPr>
+          <w:rFonts w:ascii="Consolas" w:hAnsi="Consolas"/>
+          <w:sz w:val="20"/>
+        </w:rPr>
+        <w:t>anon_id</w:t>
+      </w:r>
+      <w:r>
+        <w:t xml:space="preserve"> is a random value kept on the phone and replaced every 30 days; never send the device id, number or IMEI. The server keeps a hash of </w:t>
+      </w:r>
+      <w:r>
+        <w:rPr>
+          <w:rFonts w:ascii="Consolas" w:hAnsi="Consolas"/>
+          <w:sz w:val="20"/>
+        </w:rPr>
+        <w:t>anon_id</w:t>
+      </w:r>
+      <w:r>
+        <w:t xml:space="preserve">, the slot, the readings and the site and sector the cell belongs to; it does not keep the raw cell number. </w:t>
+      </w:r>
+      <w:r>
+        <w:rPr>
+          <w:rFonts w:ascii="Consolas" w:hAnsi="Consolas"/>
+          <w:sz w:val="20"/>
+        </w:rPr>
+        <w:t>201 {"stored": true}</w:t>
+      </w:r>
+      <w:r>
+        <w:t xml:space="preserve">; at most 8 a day per </w:t>
+      </w:r>
+      <w:r>
+        <w:rPr>
+          <w:rFonts w:ascii="Consolas" w:hAnsi="Consolas"/>
+          <w:sz w:val="20"/>
+        </w:rPr>
+        <w:t>anon_id</w:t>
+      </w:r>
+      <w:r>
+        <w:t xml:space="preserve"> (429 after). In the SDK: </w:t>
+      </w:r>
+      <w:r>
+        <w:rPr>
+          <w:rFonts w:ascii="Consolas" w:hAnsi="Consolas"/>
+          <w:sz w:val="20"/>
+        </w:rPr>
+        <w:t>NetTelemetry.setScheduledReadings(true|false)</w:t>
+      </w:r>
+      <w:r>
+        <w:t xml:space="preserve">, </w:t>
+      </w:r>
+      <w:r>
+        <w:rPr>
+          <w:rFonts w:ascii="Consolas" w:hAnsi="Consolas"/>
+          <w:sz w:val="20"/>
+        </w:rPr>
+        <w:t>scheduledReadingsEnabled()</w:t>
+      </w:r>
+      <w:r>
+        <w:t xml:space="preserve">, </w:t>
+      </w:r>
+      <w:r>
+        <w:rPr>
+          <w:rFonts w:ascii="Consolas" w:hAnsi="Consolas"/>
+          <w:sz w:val="20"/>
+        </w:rPr>
+        <w:t>scheduledReadingsAsked()</w:t>
+      </w:r>
+      <w:r>
+        <w:t>.</w:t>
+      </w:r>
+    </w:p>
+    <w:p>
       <w:pPr>
         <w:pStyle w:val="Heading1"/>
       </w:pPr>
@@ -12208,6 +12512,42 @@
                 <w:sz w:val="18"/>
               </w:rPr>
               <w:t>NetTelemetry.environment(context)</w:t>
+            </w:r>
+          </w:p>
+          <w:p>
+            <w:pPr>
+              <w:spacing w:after="0"/>
+            </w:pPr>
+            <w:r>
+              <w:rPr>
+                <w:rFonts w:ascii="Consolas" w:hAnsi="Consolas"/>
+                <w:sz w:val="18"/>
+              </w:rPr>
+              <w:t>NetTelemetry.setScheduledReadings(true)    // "Help improve NTC's network" (10b); false turns it off</w:t>
+            </w:r>
+          </w:p>
+          <w:p>
+            <w:pPr>
+              <w:spacing w:after="0"/>
+            </w:pPr>
+            <w:r>
+              <w:rPr>
+                <w:rFonts w:ascii="Consolas" w:hAnsi="Consolas"/>
+                <w:sz w:val="18"/>
+              </w:rPr>
+              <w:t>NetTelemetry.scheduledReadingsEnabled(); NetTelemetry.scheduledReadingsAsked()</w:t>
+            </w:r>
+          </w:p>
+          <w:p>
+            <w:pPr>
+              <w:spacing w:after="0"/>
+            </w:pPr>
+            <w:r>
+              <w:rPr>
+                <w:rFonts w:ascii="Consolas" w:hAnsi="Consolas"/>
+                <w:sz w:val="18"/>
+              </w:rPr>
+              <w:t>NetProblem.send(context, category, note, shareUntilFixed = true)   // 10a; Outcome.share</w:t>
             </w:r>
           </w:p>
         </w:tc>

</xml_diff>

<commit_message>
Mobile handoff: rough area with the time-of-day readings (app 1.3.1)
Co-Authored-By: Claude Opus 5.5 <noreply@anthropic.com>
</commit_message>
<xml_diff>
--- a/docs/DT-WATCH_Telemetry_Pipeline_Mobile_Handoff.docx
+++ b/docs/DT-WATCH_Telemetry_Pipeline_Mobile_Handoff.docx
@@ -40,7 +40,7 @@
         <w:t>Last updated:</w:t>
       </w:r>
       <w:r>
-        <w:t xml:space="preserve"> 2026-10-29 (app 1.3.0: "share my location until this is fixed" on a problem report, and the opt-in "Help improve NTC's network" readings; earlier: push address retried until accepted, 3G/2G level fill-in, neighbour cells with every reading, 10-digit registration number, site names on the Cells tab, reading status, indoor/outdoor tag, channel bandwidth; earlier: signed rescue sharing, serving-site lookup, SINR fill-in, upload queue). This version replaces the guide of 2026-09-21 and its two addenda.</w:t>
+        <w:t xml:space="preserve"> 2026-10-29 (app 1.3.1: optional rough area with the time-of-day readings; app 1.3.0: "share my location until this is fixed" on a problem report, and the opt-in "Help improve NTC's network" readings; earlier: push address retried until accepted, 3G/2G level fill-in, neighbour cells with every reading, 10-digit registration number, site names on the Cells tab, reading status, indoor/outdoor tag, channel bandwidth; earlier: signed rescue sharing, serving-site lookup, SINR fill-in, upload queue). This version replaces the guide of 2026-09-21 and its two addenda.</w:t>
       </w:r>
     </w:p>
     <w:p>
@@ -9523,7 +9523,7 @@
     <w:p/>
     <w:p>
       <w:r>
-        <w:t xml:space="preserve">No position is read or sent: read the cell without a GPS fix. </w:t>
+        <w:t xml:space="preserve">Read the cell without waiting for a GPS fix. </w:t>
       </w:r>
       <w:r>
         <w:rPr>
@@ -9533,7 +9533,58 @@
         <w:t>anon_id</w:t>
       </w:r>
       <w:r>
-        <w:t xml:space="preserve"> is a random value kept on the phone and replaced every 30 days; never send the device id, number or IMEI. The server keeps a hash of </w:t>
+        <w:t xml:space="preserve"> is a random value kept on the phone and replaced every 30 days; never send the device id, number or IMEI.</w:t>
+      </w:r>
+    </w:p>
+    <w:p>
+      <w:r>
+        <w:rPr>
+          <w:b/>
+        </w:rPr>
+        <w:t>Rough area (app 1.3.1), optional.</w:t>
+      </w:r>
+      <w:r>
+        <w:t xml:space="preserve"> Only when the person allowed location "Allow all the time" (</w:t>
+      </w:r>
+      <w:r>
+        <w:rPr>
+          <w:rFonts w:ascii="Consolas" w:hAnsi="Consolas"/>
+          <w:sz w:val="20"/>
+        </w:rPr>
+        <w:t>ACCESS_BACKGROUND_LOCATION</w:t>
+      </w:r>
+      <w:r>
+        <w:t xml:space="preserve">, asked after they said yes to the readings, and from Settings), add </w:t>
+      </w:r>
+      <w:r>
+        <w:rPr>
+          <w:rFonts w:ascii="Consolas" w:hAnsi="Consolas"/>
+          <w:sz w:val="20"/>
+        </w:rPr>
+        <w:t>"area_lat"</w:t>
+      </w:r>
+      <w:r>
+        <w:t xml:space="preserve"> and </w:t>
+      </w:r>
+      <w:r>
+        <w:rPr>
+          <w:rFonts w:ascii="Consolas" w:hAnsi="Consolas"/>
+          <w:sz w:val="20"/>
+        </w:rPr>
+        <w:t>"area_lng"</w:t>
+      </w:r>
+      <w:r>
+        <w:t xml:space="preserve">: the centre of the 0.005-degree square the phone is in (about 550 m north-south and 500 m east-west in Nepal), rounded on the phone: </w:t>
+      </w:r>
+      <w:r>
+        <w:rPr>
+          <w:rFonts w:ascii="Consolas" w:hAnsi="Consolas"/>
+          <w:sz w:val="20"/>
+        </w:rPr>
+        <w:t>centre = (floor(value / 0.005) + 0.5) * 0.005</w:t>
+      </w:r>
+      <w:r>
+        <w:t xml:space="preserve">. Never send the exact position. Without that permission leave both out; the reading is then placed by its cell. The server rounds again to the same grid and drops any area outside Nepal. An app on Google Play that declares background location must justify it in the Play Console; the reference app declares it in its own manifest, not in the SDK, so a host app chooses. The server keeps a hash of </w:t>
       </w:r>
       <w:r>
         <w:rPr>
@@ -9543,7 +9594,7 @@
         <w:t>anon_id</w:t>
       </w:r>
       <w:r>
-        <w:t xml:space="preserve">, the slot, the readings and the site and sector the cell belongs to; it does not keep the raw cell number. </w:t>
+        <w:t xml:space="preserve">, the slot, the readings, the site and sector the cell belongs to and the rough area when sent; it does not keep the raw cell number. </w:t>
       </w:r>
       <w:r>
         <w:rPr>

</xml_diff>

<commit_message>
Mobile handoff: ping under load and use ratings (app 1.3.2)
Co-Authored-By: Claude Opus 5.5 <noreply@anthropic.com>
</commit_message>
<xml_diff>
--- a/docs/DT-WATCH_Telemetry_Pipeline_Mobile_Handoff.docx
+++ b/docs/DT-WATCH_Telemetry_Pipeline_Mobile_Handoff.docx
@@ -40,7 +40,7 @@
         <w:t>Last updated:</w:t>
       </w:r>
       <w:r>
-        <w:t xml:space="preserve"> 2026-10-29 (app 1.3.1: optional rough area with the time-of-day readings; app 1.3.0: "share my location until this is fixed" on a problem report, and the opt-in "Help improve NTC's network" readings; earlier: push address retried until accepted, 3G/2G level fill-in, neighbour cells with every reading, 10-digit registration number, site names on the Cells tab, reading status, indoor/outdoor tag, channel bandwidth; earlier: signed rescue sharing, serving-site lookup, SINR fill-in, upload queue). This version replaces the guide of 2026-09-21 and its two addenda.</w:t>
+        <w:t xml:space="preserve"> 2026-10-29 (app 1.3.2: ping under load and use ratings in the speed test; app 1.3.1: optional rough area with the time-of-day readings; app 1.3.0: "share my location until this is fixed" on a problem report, and the opt-in "Help improve NTC's network" readings; earlier: push address retried until accepted, 3G/2G level fill-in, neighbour cells with every reading, 10-digit registration number, site names on the Cells tab, reading status, indoor/outdoor tag, channel bandwidth; earlier: signed rescue sharing, serving-site lookup, SINR fill-in, upload queue). This version replaces the guide of 2026-09-21 and its two addenda.</w:t>
       </w:r>
     </w:p>
     <w:p>
@@ -8988,7 +8988,27 @@
         <w:t>packet_loss_pct</w:t>
       </w:r>
       <w:r>
-        <w:t xml:space="preserve"> (0 to 100) is optional. </w:t>
+        <w:t xml:space="preserve"> (0 to 100) is optional. Since app 1.3.2 also send </w:t>
+      </w:r>
+      <w:r>
+        <w:rPr>
+          <w:rFonts w:ascii="Consolas" w:hAnsi="Consolas"/>
+          <w:sz w:val="20"/>
+        </w:rPr>
+        <w:t>"latency_down_ms"</w:t>
+      </w:r>
+      <w:r>
+        <w:t xml:space="preserve"> and </w:t>
+      </w:r>
+      <w:r>
+        <w:rPr>
+          <w:rFonts w:ascii="Consolas" w:hAnsi="Consolas"/>
+          <w:sz w:val="20"/>
+        </w:rPr>
+        <w:t>"latency_up_ms"</w:t>
+      </w:r>
+      <w:r>
+        <w:t xml:space="preserve"> (see below); both optional. </w:t>
       </w:r>
       <w:r>
         <w:rPr>
@@ -9019,6 +9039,407 @@
       </w:r>
       <w:r>
         <w:t>; any other value, or none, is stored blank (results from builds before 15 October 2026).</w:t>
+      </w:r>
+    </w:p>
+    <w:p>
+      <w:r>
+        <w:rPr>
+          <w:b/>
+        </w:rPr>
+        <w:t>Ping under load and use ratings (29 October 2026, app 1.3.2).</w:t>
+      </w:r>
+      <w:r>
+        <w:t xml:space="preserve"> Like Ookla, the test also measures the delay while data is moving: while the download runs, a second thread requests </w:t>
+      </w:r>
+      <w:r>
+        <w:rPr>
+          <w:rFonts w:ascii="Consolas" w:hAnsi="Consolas"/>
+          <w:sz w:val="20"/>
+        </w:rPr>
+        <w:t>GET /speedtest/empty</w:t>
+      </w:r>
+      <w:r>
+        <w:t xml:space="preserve"> every 250 ms (3 s timeout) and keeps the median of the answered pings as </w:t>
+      </w:r>
+      <w:r>
+        <w:rPr>
+          <w:rFonts w:ascii="Consolas" w:hAnsi="Consolas"/>
+          <w:sz w:val="20"/>
+        </w:rPr>
+        <w:t>latency_down_ms</w:t>
+      </w:r>
+      <w:r>
+        <w:t xml:space="preserve">; the same during the upload gives </w:t>
+      </w:r>
+      <w:r>
+        <w:rPr>
+          <w:rFonts w:ascii="Consolas" w:hAnsi="Consolas"/>
+          <w:sz w:val="20"/>
+        </w:rPr>
+        <w:t>latency_up_ms</w:t>
+      </w:r>
+      <w:r>
+        <w:t xml:space="preserve">. A line that is quick when idle but slow under load makes calls and games lag. Send both with the speed result and with a problem report. The app then grades four uses from download, upload, ping, jitter, loss and the larger of the two loaded pings (the server holds the same table, </w:t>
+      </w:r>
+      <w:r>
+        <w:rPr>
+          <w:rFonts w:ascii="Consolas" w:hAnsi="Consolas"/>
+          <w:sz w:val="20"/>
+        </w:rPr>
+        <w:t>core/speed_quality.py</w:t>
+      </w:r>
+      <w:r>
+        <w:t>; a limit whose figure is missing is skipped):</w:t>
+      </w:r>
+    </w:p>
+    <w:tbl>
+      <w:tblPr>
+        <w:tblStyle w:val="TableGrid"/>
+        <w:tblW w:type="auto" w:w="0"/>
+        <w:jc w:val="center"/>
+        <w:tblLook w:firstColumn="1" w:firstRow="1" w:lastColumn="0" w:lastRow="0" w:noHBand="0" w:noVBand="1" w:val="04A0"/>
+      </w:tblPr>
+      <w:tblGrid>
+        <w:gridCol w:w="2160"/>
+        <w:gridCol w:w="2160"/>
+        <w:gridCol w:w="2160"/>
+        <w:gridCol w:w="2160"/>
+      </w:tblGrid>
+      <w:tr>
+        <w:tc>
+          <w:tcPr>
+            <w:tcW w:type="dxa" w:w="2160"/>
+            <w:shd w:val="clear" w:color="auto" w:fill="0B1626"/>
+          </w:tcPr>
+          <w:p>
+            <w:r>
+              <w:rPr>
+                <w:b/>
+                <w:color w:val="FFFFFF"/>
+                <w:sz w:val="19"/>
+              </w:rPr>
+              <w:t>Use</w:t>
+            </w:r>
+          </w:p>
+        </w:tc>
+        <w:tc>
+          <w:tcPr>
+            <w:tcW w:type="dxa" w:w="2160"/>
+            <w:shd w:val="clear" w:color="auto" w:fill="0B1626"/>
+          </w:tcPr>
+          <w:p>
+            <w:r>
+              <w:rPr>
+                <w:b/>
+                <w:color w:val="FFFFFF"/>
+                <w:sz w:val="19"/>
+              </w:rPr>
+              <w:t>Very good</w:t>
+            </w:r>
+          </w:p>
+        </w:tc>
+        <w:tc>
+          <w:tcPr>
+            <w:tcW w:type="dxa" w:w="2160"/>
+            <w:shd w:val="clear" w:color="auto" w:fill="0B1626"/>
+          </w:tcPr>
+          <w:p>
+            <w:r>
+              <w:rPr>
+                <w:b/>
+                <w:color w:val="FFFFFF"/>
+                <w:sz w:val="19"/>
+              </w:rPr>
+              <w:t>Good</w:t>
+            </w:r>
+          </w:p>
+        </w:tc>
+        <w:tc>
+          <w:tcPr>
+            <w:tcW w:type="dxa" w:w="2160"/>
+            <w:shd w:val="clear" w:color="auto" w:fill="0B1626"/>
+          </w:tcPr>
+          <w:p>
+            <w:r>
+              <w:rPr>
+                <w:b/>
+                <w:color w:val="FFFFFF"/>
+                <w:sz w:val="19"/>
+              </w:rPr>
+              <w:t>Fair</w:t>
+            </w:r>
+          </w:p>
+        </w:tc>
+      </w:tr>
+      <w:tr>
+        <w:tc>
+          <w:tcPr>
+            <w:tcW w:type="dxa" w:w="2160"/>
+          </w:tcPr>
+          <w:p>
+            <w:r>
+              <w:rPr>
+                <w:sz w:val="19"/>
+              </w:rPr>
+              <w:t>Browsing</w:t>
+            </w:r>
+          </w:p>
+        </w:tc>
+        <w:tc>
+          <w:tcPr>
+            <w:tcW w:type="dxa" w:w="2160"/>
+          </w:tcPr>
+          <w:p>
+            <w:r>
+              <w:rPr>
+                <w:sz w:val="19"/>
+              </w:rPr>
+              <w:t>down &gt;= 25, ping &lt;= 50, loaded &lt;= 300</w:t>
+            </w:r>
+          </w:p>
+        </w:tc>
+        <w:tc>
+          <w:tcPr>
+            <w:tcW w:type="dxa" w:w="2160"/>
+          </w:tcPr>
+          <w:p>
+            <w:r>
+              <w:rPr>
+                <w:sz w:val="19"/>
+              </w:rPr>
+              <w:t>down &gt;= 10, ping &lt;= 100, loaded &lt;= 600</w:t>
+            </w:r>
+          </w:p>
+        </w:tc>
+        <w:tc>
+          <w:tcPr>
+            <w:tcW w:type="dxa" w:w="2160"/>
+          </w:tcPr>
+          <w:p>
+            <w:r>
+              <w:rPr>
+                <w:sz w:val="19"/>
+              </w:rPr>
+              <w:t>down &gt;= 3, ping &lt;= 200</w:t>
+            </w:r>
+          </w:p>
+        </w:tc>
+      </w:tr>
+      <w:tr>
+        <w:tc>
+          <w:tcPr>
+            <w:tcW w:type="dxa" w:w="2160"/>
+            <w:shd w:val="clear" w:color="auto" w:fill="EEF2F7"/>
+          </w:tcPr>
+          <w:p>
+            <w:r>
+              <w:rPr>
+                <w:sz w:val="19"/>
+              </w:rPr>
+              <w:t>Video streaming</w:t>
+            </w:r>
+          </w:p>
+        </w:tc>
+        <w:tc>
+          <w:tcPr>
+            <w:tcW w:type="dxa" w:w="2160"/>
+            <w:shd w:val="clear" w:color="auto" w:fill="EEF2F7"/>
+          </w:tcPr>
+          <w:p>
+            <w:r>
+              <w:rPr>
+                <w:sz w:val="19"/>
+              </w:rPr>
+              <w:t>down &gt;= 25</w:t>
+            </w:r>
+          </w:p>
+        </w:tc>
+        <w:tc>
+          <w:tcPr>
+            <w:tcW w:type="dxa" w:w="2160"/>
+            <w:shd w:val="clear" w:color="auto" w:fill="EEF2F7"/>
+          </w:tcPr>
+          <w:p>
+            <w:r>
+              <w:rPr>
+                <w:sz w:val="19"/>
+              </w:rPr>
+              <w:t>down &gt;= 10</w:t>
+            </w:r>
+          </w:p>
+        </w:tc>
+        <w:tc>
+          <w:tcPr>
+            <w:tcW w:type="dxa" w:w="2160"/>
+            <w:shd w:val="clear" w:color="auto" w:fill="EEF2F7"/>
+          </w:tcPr>
+          <w:p>
+            <w:r>
+              <w:rPr>
+                <w:sz w:val="19"/>
+              </w:rPr>
+              <w:t>down &gt;= 3</w:t>
+            </w:r>
+          </w:p>
+        </w:tc>
+      </w:tr>
+      <w:tr>
+        <w:tc>
+          <w:tcPr>
+            <w:tcW w:type="dxa" w:w="2160"/>
+          </w:tcPr>
+          <w:p>
+            <w:r>
+              <w:rPr>
+                <w:sz w:val="19"/>
+              </w:rPr>
+              <w:t>Gaming</w:t>
+            </w:r>
+          </w:p>
+        </w:tc>
+        <w:tc>
+          <w:tcPr>
+            <w:tcW w:type="dxa" w:w="2160"/>
+          </w:tcPr>
+          <w:p>
+            <w:r>
+              <w:rPr>
+                <w:sz w:val="19"/>
+              </w:rPr>
+              <w:t>down &gt;= 5, ping &lt;= 30, jitter &lt;= 10, loss &lt;= 0.5, loaded &lt;= 100</w:t>
+            </w:r>
+          </w:p>
+        </w:tc>
+        <w:tc>
+          <w:tcPr>
+            <w:tcW w:type="dxa" w:w="2160"/>
+          </w:tcPr>
+          <w:p>
+            <w:r>
+              <w:rPr>
+                <w:sz w:val="19"/>
+              </w:rPr>
+              <w:t>down &gt;= 3, ping &lt;= 60, jitter &lt;= 20, loss &lt;= 1, loaded &lt;= 200</w:t>
+            </w:r>
+          </w:p>
+        </w:tc>
+        <w:tc>
+          <w:tcPr>
+            <w:tcW w:type="dxa" w:w="2160"/>
+          </w:tcPr>
+          <w:p>
+            <w:r>
+              <w:rPr>
+                <w:sz w:val="19"/>
+              </w:rPr>
+              <w:t>down &gt;= 1, ping &lt;= 100, jitter &lt;= 30, loss &lt;= 2.5, loaded &lt;= 400</w:t>
+            </w:r>
+          </w:p>
+        </w:tc>
+      </w:tr>
+      <w:tr>
+        <w:tc>
+          <w:tcPr>
+            <w:tcW w:type="dxa" w:w="2160"/>
+            <w:shd w:val="clear" w:color="auto" w:fill="EEF2F7"/>
+          </w:tcPr>
+          <w:p>
+            <w:r>
+              <w:rPr>
+                <w:sz w:val="19"/>
+              </w:rPr>
+              <w:t>Video calls</w:t>
+            </w:r>
+          </w:p>
+        </w:tc>
+        <w:tc>
+          <w:tcPr>
+            <w:tcW w:type="dxa" w:w="2160"/>
+            <w:shd w:val="clear" w:color="auto" w:fill="EEF2F7"/>
+          </w:tcPr>
+          <w:p>
+            <w:r>
+              <w:rPr>
+                <w:sz w:val="19"/>
+              </w:rPr>
+              <w:t>down and up &gt;= 10, ping &lt;= 50, jitter &lt;= 15, loss &lt;= 0.5, loaded &lt;= 150</w:t>
+            </w:r>
+          </w:p>
+        </w:tc>
+        <w:tc>
+          <w:tcPr>
+            <w:tcW w:type="dxa" w:w="2160"/>
+            <w:shd w:val="clear" w:color="auto" w:fill="EEF2F7"/>
+          </w:tcPr>
+          <w:p>
+            <w:r>
+              <w:rPr>
+                <w:sz w:val="19"/>
+              </w:rPr>
+              <w:t>down and up &gt;= 3, ping &lt;= 100, jitter &lt;= 30, loss &lt;= 1, loaded &lt;= 250</w:t>
+            </w:r>
+          </w:p>
+        </w:tc>
+        <w:tc>
+          <w:tcPr>
+            <w:tcW w:type="dxa" w:w="2160"/>
+            <w:shd w:val="clear" w:color="auto" w:fill="EEF2F7"/>
+          </w:tcPr>
+          <w:p>
+            <w:r>
+              <w:rPr>
+                <w:sz w:val="19"/>
+              </w:rPr>
+              <w:t>down and up &gt;= 1, ping &lt;= 150, jitter &lt;= 50, loss &lt;= 3, loaded &lt;= 500</w:t>
+            </w:r>
+          </w:p>
+        </w:tc>
+      </w:tr>
+    </w:tbl>
+    <w:p/>
+    <w:p>
+      <w:r>
+        <w:t xml:space="preserve">Anything below Fair is Poor (Mbps for speeds, ms for times, % for loss). In the SDK: </w:t>
+      </w:r>
+      <w:r>
+        <w:rPr>
+          <w:rFonts w:ascii="Consolas" w:hAnsi="Consolas"/>
+          <w:sz w:val="20"/>
+        </w:rPr>
+        <w:t>SpeedTest.Result.latencyDownMs</w:t>
+      </w:r>
+      <w:r>
+        <w:t xml:space="preserve"> / </w:t>
+      </w:r>
+      <w:r>
+        <w:rPr>
+          <w:rFonts w:ascii="Consolas" w:hAnsi="Consolas"/>
+          <w:sz w:val="20"/>
+        </w:rPr>
+        <w:t>latencyUpMs</w:t>
+      </w:r>
+      <w:r>
+        <w:t xml:space="preserve">, </w:t>
+      </w:r>
+      <w:r>
+        <w:rPr>
+          <w:rFonts w:ascii="Consolas" w:hAnsi="Consolas"/>
+          <w:sz w:val="20"/>
+        </w:rPr>
+        <w:t>SpeedRatings.rate(result)</w:t>
+      </w:r>
+      <w:r>
+        <w:t xml:space="preserve"> and </w:t>
+      </w:r>
+      <w:r>
+        <w:rPr>
+          <w:rFonts w:ascii="Consolas" w:hAnsi="Consolas"/>
+          <w:sz w:val="20"/>
+        </w:rPr>
+        <w:t>SpeedRatings.describe(result)</w:t>
+      </w:r>
+      <w:r>
+        <w:t>.</w:t>
       </w:r>
     </w:p>
     <w:p>

</xml_diff>

<commit_message>
Mobile handoff: exact position with time-of-day readings, background location (app 1.3.3)
Co-Authored-By: Claude Opus 5.5 <noreply@anthropic.com>
</commit_message>
<xml_diff>
--- a/docs/DT-WATCH_Telemetry_Pipeline_Mobile_Handoff.docx
+++ b/docs/DT-WATCH_Telemetry_Pipeline_Mobile_Handoff.docx
@@ -40,7 +40,7 @@
         <w:t>Last updated:</w:t>
       </w:r>
       <w:r>
-        <w:t xml:space="preserve"> 2026-10-29 (app 1.3.2: ping under load and use ratings in the speed test; app 1.3.1: optional rough area with the time-of-day readings; app 1.3.0: "share my location until this is fixed" on a problem report, and the opt-in "Help improve NTC's network" readings; earlier: push address retried until accepted, 3G/2G level fill-in, neighbour cells with every reading, 10-digit registration number, site names on the Cells tab, reading status, indoor/outdoor tag, channel bandwidth; earlier: signed rescue sharing, serving-site lookup, SINR fill-in, upload queue). This version replaces the guide of 2026-09-21 and its two addenda.</w:t>
+        <w:t xml:space="preserve"> 2026-10-30 (app 1.3.3: exact position with the time-of-day readings, kept 90 days; background readings ask for location "Allow all the time" and use a fix up to 2 minutes old; app 1.3.2: ping under load and use ratings in the speed test; app 1.3.1: optional rough area with the time-of-day readings; app 1.3.0: "share my location until this is fixed" on a problem report, and the opt-in "Help improve NTC's network" readings; earlier: push address retried until accepted, 3G/2G level fill-in, neighbour cells with every reading, 10-digit registration number, site names on the Cells tab, reading status, indoor/outdoor tag, channel bandwidth; earlier: signed rescue sharing, serving-site lookup, SINR fill-in, upload queue). This version replaces the guide of 2026-09-21 and its two addenda.</w:t>
       </w:r>
     </w:p>
     <w:p>
@@ -5381,7 +5381,7 @@
               <w:rPr>
                 <w:sz w:val="19"/>
               </w:rPr>
-              <w:t>The background job runs, every 15 minutes while sharing</w:t>
+              <w:t>The background job runs, every 15 minutes while sharing. Android gives it a GPS position only with location "Allow all the time"; without it the reading carries network, level and quality but no position. When no fresh fix arrives, use a position the phone knew in the last 2 minutes (app 1.3.3)</w:t>
             </w:r>
           </w:p>
         </w:tc>
@@ -9962,7 +9962,7 @@
         <w:rPr>
           <w:b/>
         </w:rPr>
-        <w:t>Rough area (app 1.3.1), optional.</w:t>
+        <w:t>Position (app 1.3.3; app 1.3.1 sent only the rough area), optional.</w:t>
       </w:r>
       <w:r>
         <w:t xml:space="preserve"> Only when the person allowed location "Allow all the time" (</w:t>
@@ -9982,6 +9982,36 @@
           <w:rFonts w:ascii="Consolas" w:hAnsi="Consolas"/>
           <w:sz w:val="20"/>
         </w:rPr>
+        <w:t>"lat"</w:t>
+      </w:r>
+      <w:r>
+        <w:t xml:space="preserve">, </w:t>
+      </w:r>
+      <w:r>
+        <w:rPr>
+          <w:rFonts w:ascii="Consolas" w:hAnsi="Consolas"/>
+          <w:sz w:val="20"/>
+        </w:rPr>
+        <w:t>"lng"</w:t>
+      </w:r>
+      <w:r>
+        <w:t xml:space="preserve"> and </w:t>
+      </w:r>
+      <w:r>
+        <w:rPr>
+          <w:rFonts w:ascii="Consolas" w:hAnsi="Consolas"/>
+          <w:sz w:val="20"/>
+        </w:rPr>
+        <w:t>"gps_accuracy_m"</w:t>
+      </w:r>
+      <w:r>
+        <w:t xml:space="preserve"> (a fresh high-accuracy fix, else the last known one), plus </w:t>
+      </w:r>
+      <w:r>
+        <w:rPr>
+          <w:rFonts w:ascii="Consolas" w:hAnsi="Consolas"/>
+          <w:sz w:val="20"/>
+        </w:rPr>
         <w:t>"area_lat"</w:t>
       </w:r>
       <w:r>
@@ -9995,7 +10025,7 @@
         <w:t>"area_lng"</w:t>
       </w:r>
       <w:r>
-        <w:t xml:space="preserve">: the centre of the 0.005-degree square the phone is in (about 550 m north-south and 500 m east-west in Nepal), rounded on the phone: </w:t>
+        <w:t xml:space="preserve">: the centre of the 0.005-degree square the phone is in (about 550 m north-south and 500 m east-west in Nepal): </w:t>
       </w:r>
       <w:r>
         <w:rPr>
@@ -10005,7 +10035,27 @@
         <w:t>centre = (floor(value / 0.005) + 0.5) * 0.005</w:t>
       </w:r>
       <w:r>
-        <w:t xml:space="preserve">. Never send the exact position. Without that permission leave both out; the reading is then placed by its cell. The server rounds again to the same grid and drops any area outside Nepal. An app on Google Play that declares background location must justify it in the Play Console; the reference app declares it in its own manifest, not in the SDK, so a host app chooses. The server keeps a hash of </w:t>
+        <w:t xml:space="preserve">. The consent text must say that the position is sent and that NTC keeps the readings 90 days. Without that permission leave all of them out; the reading is then placed by its cell. The server drops a position outside Nepal and works out the square itself when only </w:t>
+      </w:r>
+      <w:r>
+        <w:rPr>
+          <w:rFonts w:ascii="Consolas" w:hAnsi="Consolas"/>
+          <w:sz w:val="20"/>
+        </w:rPr>
+        <w:t>lat</w:t>
+      </w:r>
+      <w:r>
+        <w:t>/</w:t>
+      </w:r>
+      <w:r>
+        <w:rPr>
+          <w:rFonts w:ascii="Consolas" w:hAnsi="Consolas"/>
+          <w:sz w:val="20"/>
+        </w:rPr>
+        <w:t>lng</w:t>
+      </w:r>
+      <w:r>
+        <w:t xml:space="preserve"> arrive. An app on Google Play that declares background location must justify it in the Play Console; the reference app declares it in its own manifest, not in the SDK, so a host app chooses. The server keeps a hash of </w:t>
       </w:r>
       <w:r>
         <w:rPr>
@@ -10015,7 +10065,7 @@
         <w:t>anon_id</w:t>
       </w:r>
       <w:r>
-        <w:t xml:space="preserve">, the slot, the readings, the site and sector the cell belongs to and the rough area when sent; it does not keep the raw cell number. </w:t>
+        <w:t xml:space="preserve">, the slot, the readings, the site and sector the cell belongs to and the position and square when sent, for 90 days; it does not keep the raw cell number. </w:t>
       </w:r>
       <w:r>
         <w:rPr>
@@ -13771,9 +13821,6 @@
         <w:pStyle w:val="ListBullet"/>
       </w:pPr>
       <w:r>
-        <w:t xml:space="preserve">Not requested: </w:t>
-      </w:r>
-      <w:r>
         <w:rPr>
           <w:rFonts w:ascii="Consolas" w:hAnsi="Consolas"/>
           <w:sz w:val="20"/>
@@ -13781,7 +13828,7 @@
         <w:t>ACCESS_BACKGROUND_LOCATION</w:t>
       </w:r>
       <w:r>
-        <w:t>.</w:t>
+        <w:t xml:space="preserve"> is declared by the app, not the SDK. The app asks for it when sharing starts (readings with the app closed then carry a position) and after a yes to "Help improve NTC's network"; a host app on Google Play must justify it in the Play Console.</w:t>
       </w:r>
     </w:p>
     <w:p>

</xml_diff>

<commit_message>
Hand-marked indoor spot and SIM slot on phone readings
- position_source 'manual' (migration 0158): the person marked their spot on
  the map for an indoor test; Collections says so.
- sim_slot (migration 0159): which SIM on a phone with two active SIMs. The two
  SIMs of one phone read together are not flagged as a burst.
- Mobile handoff updated for app 1.3.17.

Co-Authored-By: Claude Opus 5.5 <noreply@anthropic.com>
</commit_message>
<xml_diff>
--- a/docs/DT-WATCH_Telemetry_Pipeline_Mobile_Handoff.docx
+++ b/docs/DT-WATCH_Telemetry_Pipeline_Mobile_Handoff.docx
@@ -40,7 +40,27 @@
         <w:t>Last updated:</w:t>
       </w:r>
       <w:r>
-        <w:t xml:space="preserve"> 2026-10-30 (app 1.3.3: exact position with the time-of-day readings, kept 90 days; background readings ask for location "Allow all the time" and use a fix up to 2 minutes old; app 1.3.2: ping under load and use ratings in the speed test; app 1.3.1: optional rough area with the time-of-day readings; app 1.3.0: "share my location until this is fixed" on a problem report, and the opt-in "Help improve NTC's network" readings; earlier: push address retried until accepted, 3G/2G level fill-in, neighbour cells with every reading, 10-digit registration number, site names on the Cells tab, reading status, indoor/outdoor tag, channel bandwidth; earlier: signed rescue sharing, serving-site lookup, SINR fill-in, upload queue). This version replaces the guide of 2026-09-21 and its two addenda.</w:t>
+        <w:t xml:space="preserve"> 2026-10-31 (app 1.3.17: two-SIM phones with </w:t>
+      </w:r>
+      <w:r>
+        <w:rPr>
+          <w:rFonts w:ascii="Consolas" w:hAnsi="Consolas"/>
+          <w:sz w:val="20"/>
+        </w:rPr>
+        <w:t>sim_slot</w:t>
+      </w:r>
+      <w:r>
+        <w:t xml:space="preserve">, marked indoor spot with </w:t>
+      </w:r>
+      <w:r>
+        <w:rPr>
+          <w:rFonts w:ascii="Consolas" w:hAnsi="Consolas"/>
+          <w:sz w:val="20"/>
+        </w:rPr>
+        <w:t>position_source</w:t>
+      </w:r>
+      <w:r>
+        <w:t>, cleaner drive routes, all permissions asked at the first start after install or update, new app icon and signal meter; app 1.3.3: exact position with the time-of-day readings, kept 90 days; background readings ask for location "Allow all the time" and use a fix up to 2 minutes old; app 1.3.2: ping under load and use ratings in the speed test; app 1.3.1: optional rough area with the time-of-day readings; app 1.3.0: "share my location until this is fixed" on a problem report, and the opt-in "Help improve NTC's network" readings; earlier: push address retried until accepted, 3G/2G level fill-in, neighbour cells with every reading, 10-digit registration number, site names on the Cells tab, reading status, indoor/outdoor tag, channel bandwidth; earlier: signed rescue sharing, serving-site lookup, SINR fill-in, upload queue). This version replaces the guide of 2026-09-21 and its two addenda.</w:t>
       </w:r>
     </w:p>
     <w:p>
@@ -4563,6 +4583,100 @@
                 <w:sz w:val="19"/>
               </w:rPr>
               <w:t>. Added 2026-10-26</w:t>
+            </w:r>
+          </w:p>
+        </w:tc>
+      </w:tr>
+      <w:tr>
+        <w:tc>
+          <w:tcPr>
+            <w:tcW w:type="dxa" w:w="2880"/>
+            <w:shd w:val="clear" w:color="auto" w:fill="EEF2F7"/>
+          </w:tcPr>
+          <w:p>
+            <w:r>
+              <w:rPr>
+                <w:rFonts w:ascii="Consolas" w:hAnsi="Consolas"/>
+                <w:sz w:val="18"/>
+              </w:rPr>
+              <w:t>position_source</w:t>
+            </w:r>
+          </w:p>
+        </w:tc>
+        <w:tc>
+          <w:tcPr>
+            <w:tcW w:type="dxa" w:w="2880"/>
+            <w:shd w:val="clear" w:color="auto" w:fill="EEF2F7"/>
+          </w:tcPr>
+          <w:p>
+            <w:r>
+              <w:rPr>
+                <w:sz w:val="19"/>
+              </w:rPr>
+              <w:t>string</w:t>
+            </w:r>
+          </w:p>
+        </w:tc>
+        <w:tc>
+          <w:tcPr>
+            <w:tcW w:type="dxa" w:w="2880"/>
+            <w:shd w:val="clear" w:color="auto" w:fill="EEF2F7"/>
+          </w:tcPr>
+          <w:p>
+            <w:r>
+              <w:rPr>
+                <w:rFonts w:ascii="Consolas" w:hAnsi="Consolas"/>
+                <w:sz w:val="18"/>
+              </w:rPr>
+              <w:t>manual</w:t>
+            </w:r>
+            <w:r>
+              <w:rPr>
+                <w:sz w:val="19"/>
+              </w:rPr>
+              <w:t xml:space="preserve"> when the person marked their spot on the map for an indoor test; leave out for GPS. Added 2026-10-30</w:t>
+            </w:r>
+          </w:p>
+        </w:tc>
+      </w:tr>
+      <w:tr>
+        <w:tc>
+          <w:tcPr>
+            <w:tcW w:type="dxa" w:w="2880"/>
+          </w:tcPr>
+          <w:p>
+            <w:r>
+              <w:rPr>
+                <w:rFonts w:ascii="Consolas" w:hAnsi="Consolas"/>
+                <w:sz w:val="18"/>
+              </w:rPr>
+              <w:t>sim_slot</w:t>
+            </w:r>
+          </w:p>
+        </w:tc>
+        <w:tc>
+          <w:tcPr>
+            <w:tcW w:type="dxa" w:w="2880"/>
+          </w:tcPr>
+          <w:p>
+            <w:r>
+              <w:rPr>
+                <w:sz w:val="19"/>
+              </w:rPr>
+              <w:t>int</w:t>
+            </w:r>
+          </w:p>
+        </w:tc>
+        <w:tc>
+          <w:tcPr>
+            <w:tcW w:type="dxa" w:w="2880"/>
+          </w:tcPr>
+          <w:p>
+            <w:r>
+              <w:rPr>
+                <w:sz w:val="19"/>
+              </w:rPr>
+              <w:t>1 to 4: the SIM slot, only on a phone with two active SIMs. Leave out with one SIM. Added 2026-10-31</w:t>
             </w:r>
           </w:p>
         </w:tc>
@@ -13853,6 +13967,118 @@
       </w:pPr>
       <w:r>
         <w:t>A drive test records a fix every 2 seconds and drops fixes worse than 30 m.</w:t>
+      </w:r>
+    </w:p>
+    <w:p>
+      <w:pPr>
+        <w:pStyle w:val="ListBullet"/>
+      </w:pPr>
+      <w:r>
+        <w:t>Drive routes (app 1.3.6): the route starts when two fixes in a row agree within 50 m; a fix implying more than 70 m/s is dropped unless three agree; while the phone is still (no confident speed of 2 m/s or more, and within 20 m or both fixes' accuracy of the last point) readings keep that point's position. Indoors the reported speed can be about 1 m/s on a phone lying still.</w:t>
+      </w:r>
+    </w:p>
+    <w:p>
+      <w:pPr>
+        <w:pStyle w:val="ListBullet"/>
+      </w:pPr>
+      <w:r>
+        <w:t xml:space="preserve">Indoor spot (app 1.3.7): with "Inside a building" chosen, press and hold on the Map tab marks the spot. Every drive reading then uses it instead of GPS and carries </w:t>
+      </w:r>
+      <w:r>
+        <w:rPr>
+          <w:rFonts w:ascii="Consolas" w:hAnsi="Consolas"/>
+          <w:sz w:val="20"/>
+        </w:rPr>
+        <w:t>position_source: manual</w:t>
+      </w:r>
+      <w:r>
+        <w:t xml:space="preserve">, until Outdoors, In a vehicle or automatic is chosen, or the drive stops. SDK: </w:t>
+      </w:r>
+      <w:r>
+        <w:rPr>
+          <w:rFonts w:ascii="Consolas" w:hAnsi="Consolas"/>
+          <w:sz w:val="20"/>
+        </w:rPr>
+        <w:t>setManualPosition</w:t>
+      </w:r>
+      <w:r>
+        <w:t xml:space="preserve">, </w:t>
+      </w:r>
+      <w:r>
+        <w:rPr>
+          <w:rFonts w:ascii="Consolas" w:hAnsi="Consolas"/>
+          <w:sz w:val="20"/>
+        </w:rPr>
+        <w:t>clearManualPosition</w:t>
+      </w:r>
+      <w:r>
+        <w:t xml:space="preserve">, </w:t>
+      </w:r>
+      <w:r>
+        <w:rPr>
+          <w:rFonts w:ascii="Consolas" w:hAnsi="Consolas"/>
+          <w:sz w:val="20"/>
+        </w:rPr>
+        <w:t>manualPosition</w:t>
+      </w:r>
+      <w:r>
+        <w:t>.</w:t>
+      </w:r>
+    </w:p>
+    <w:p>
+      <w:pPr>
+        <w:pStyle w:val="ListBullet"/>
+      </w:pPr>
+      <w:r>
+        <w:t xml:space="preserve">Two SIMs (app 1.3.17): </w:t>
+      </w:r>
+      <w:r>
+        <w:rPr>
+          <w:rFonts w:ascii="Consolas" w:hAnsi="Consolas"/>
+          <w:sz w:val="20"/>
+        </w:rPr>
+        <w:t>getAllCellInfo()</w:t>
+      </w:r>
+      <w:r>
+        <w:t xml:space="preserve"> returns the registered cells of every SIM whichever SIM asks, so match a SIM's cell by operator, and for two SIMs of one operator by slot order. The periodic job also reads a second Nepal Telecom SIM; another operator's second SIM stays on the phone. The two readings arrive under a second apart, which the server does not count as a burst when </w:t>
+      </w:r>
+      <w:r>
+        <w:rPr>
+          <w:rFonts w:ascii="Consolas" w:hAnsi="Consolas"/>
+          <w:sz w:val="20"/>
+        </w:rPr>
+        <w:t>sim_slot</w:t>
+      </w:r>
+      <w:r>
+        <w:t xml:space="preserve"> differs. SDK: </w:t>
+      </w:r>
+      <w:r>
+        <w:rPr>
+          <w:rFonts w:ascii="Consolas" w:hAnsi="Consolas"/>
+          <w:sz w:val="20"/>
+        </w:rPr>
+        <w:t>activeSims()</w:t>
+      </w:r>
+      <w:r>
+        <w:t xml:space="preserve">, </w:t>
+      </w:r>
+      <w:r>
+        <w:rPr>
+          <w:rFonts w:ascii="Consolas" w:hAnsi="Consolas"/>
+          <w:sz w:val="20"/>
+        </w:rPr>
+        <w:t>readLiveCell(sim)</w:t>
+      </w:r>
+      <w:r>
+        <w:t>.</w:t>
+      </w:r>
+    </w:p>
+    <w:p>
+      <w:pPr>
+        <w:pStyle w:val="ListBullet"/>
+      </w:pPr>
+      <w:r>
+        <w:t>Permissions (app 1.3.9): all are asked at the first start after install or update: location, phone state and notifications, then "Allow all the time". Later actions ask only for one still missing or withdrawn. The camera is asked when Site photo first opens.</w:t>
       </w:r>
     </w:p>
     <w:p>

</xml_diff>